<commit_message>
Second Base Template works.
</commit_message>
<xml_diff>
--- a/resources/Templates/subdocs/Charge_Grid_Template.docx
+++ b/resources/Templates/subdocs/Charge_Grid_Template.docx
@@ -37,6 +37,7 @@
                 <w:tab w:val="left" w:pos="4320"/>
                 <w:tab w:val="left" w:pos="4680"/>
               </w:tabs>
+              <w:contextualSpacing/>
               <w:rPr>
                 <w:rFonts w:ascii="Palatino Linotype" w:hAnsi="Palatino Linotype"/>
                 <w:b/>
@@ -75,6 +76,7 @@
                 <w:tab w:val="left" w:pos="4320"/>
                 <w:tab w:val="left" w:pos="4680"/>
               </w:tabs>
+              <w:contextualSpacing/>
               <w:rPr>
                 <w:rFonts w:ascii="Palatino Linotype" w:hAnsi="Palatino Linotype"/>
                 <w:b/>
@@ -157,6 +159,7 @@
                 <w:tab w:val="left" w:pos="4320"/>
                 <w:tab w:val="left" w:pos="4680"/>
               </w:tabs>
+              <w:contextualSpacing/>
               <w:rPr>
                 <w:rFonts w:ascii="Palatino Linotype" w:hAnsi="Palatino Linotype"/>
                 <w:b/>
@@ -229,6 +232,7 @@
                 <w:tab w:val="left" w:pos="4320"/>
                 <w:tab w:val="left" w:pos="4680"/>
               </w:tabs>
+              <w:contextualSpacing/>
               <w:rPr>
                 <w:rFonts w:ascii="Palatino Linotype" w:hAnsi="Palatino Linotype"/>
                 <w:b/>
@@ -316,6 +320,7 @@
                 <w:tab w:val="left" w:pos="4320"/>
                 <w:tab w:val="left" w:pos="4680"/>
               </w:tabs>
+              <w:contextualSpacing/>
               <w:rPr>
                 <w:rFonts w:ascii="Palatino Linotype" w:hAnsi="Palatino Linotype"/>
                 <w:b/>
@@ -354,6 +359,7 @@
                 <w:tab w:val="left" w:pos="4320"/>
                 <w:tab w:val="left" w:pos="4680"/>
               </w:tabs>
+              <w:contextualSpacing/>
               <w:rPr>
                 <w:rFonts w:ascii="Palatino Linotype" w:hAnsi="Palatino Linotype"/>
                 <w:b/>
@@ -436,6 +442,7 @@
                 <w:tab w:val="left" w:pos="4320"/>
                 <w:tab w:val="left" w:pos="4680"/>
               </w:tabs>
+              <w:contextualSpacing/>
               <w:rPr>
                 <w:rFonts w:ascii="Palatino Linotype" w:hAnsi="Palatino Linotype"/>
                 <w:b/>
@@ -508,6 +515,7 @@
                 <w:tab w:val="left" w:pos="4320"/>
                 <w:tab w:val="left" w:pos="4680"/>
               </w:tabs>
+              <w:contextualSpacing/>
               <w:rPr>
                 <w:rFonts w:ascii="Palatino Linotype" w:hAnsi="Palatino Linotype"/>
                 <w:b/>
@@ -595,6 +603,7 @@
                 <w:tab w:val="left" w:pos="4320"/>
                 <w:tab w:val="left" w:pos="4680"/>
               </w:tabs>
+              <w:contextualSpacing/>
               <w:rPr>
                 <w:rFonts w:ascii="Palatino Linotype" w:hAnsi="Palatino Linotype"/>
                 <w:b/>
@@ -633,6 +642,7 @@
                 <w:tab w:val="left" w:pos="4320"/>
                 <w:tab w:val="left" w:pos="4680"/>
               </w:tabs>
+              <w:contextualSpacing/>
               <w:rPr>
                 <w:rFonts w:ascii="Palatino Linotype" w:hAnsi="Palatino Linotype"/>
                 <w:b/>
@@ -715,6 +725,7 @@
                 <w:tab w:val="left" w:pos="4320"/>
                 <w:tab w:val="left" w:pos="4680"/>
               </w:tabs>
+              <w:contextualSpacing/>
               <w:rPr>
                 <w:rFonts w:ascii="Palatino Linotype" w:hAnsi="Palatino Linotype"/>
                 <w:b/>
@@ -787,6 +798,7 @@
                 <w:tab w:val="left" w:pos="4320"/>
                 <w:tab w:val="left" w:pos="4680"/>
               </w:tabs>
+              <w:contextualSpacing/>
               <w:rPr>
                 <w:rFonts w:ascii="Palatino Linotype" w:hAnsi="Palatino Linotype"/>
                 <w:b/>
@@ -874,6 +886,7 @@
                 <w:tab w:val="left" w:pos="4320"/>
                 <w:tab w:val="left" w:pos="4680"/>
               </w:tabs>
+              <w:contextualSpacing/>
               <w:rPr>
                 <w:rFonts w:ascii="Palatino Linotype" w:hAnsi="Palatino Linotype"/>
                 <w:b/>
@@ -912,6 +925,7 @@
                 <w:tab w:val="left" w:pos="4320"/>
                 <w:tab w:val="left" w:pos="4680"/>
               </w:tabs>
+              <w:contextualSpacing/>
               <w:rPr>
                 <w:rFonts w:ascii="Palatino Linotype" w:hAnsi="Palatino Linotype"/>
                 <w:b/>
@@ -994,6 +1008,7 @@
                 <w:tab w:val="left" w:pos="4320"/>
                 <w:tab w:val="left" w:pos="4680"/>
               </w:tabs>
+              <w:contextualSpacing/>
               <w:rPr>
                 <w:rFonts w:ascii="Palatino Linotype" w:hAnsi="Palatino Linotype"/>
                 <w:b/>
@@ -1066,6 +1081,7 @@
                 <w:tab w:val="left" w:pos="4320"/>
                 <w:tab w:val="left" w:pos="4680"/>
               </w:tabs>
+              <w:contextualSpacing/>
               <w:rPr>
                 <w:rFonts w:ascii="Palatino Linotype" w:hAnsi="Palatino Linotype"/>
                 <w:b/>
@@ -1153,6 +1169,7 @@
                 <w:tab w:val="left" w:pos="4320"/>
                 <w:tab w:val="left" w:pos="4680"/>
               </w:tabs>
+              <w:contextualSpacing/>
               <w:rPr>
                 <w:rFonts w:ascii="Palatino Linotype" w:hAnsi="Palatino Linotype"/>
                 <w:b/>
@@ -1191,6 +1208,7 @@
                 <w:tab w:val="left" w:pos="4320"/>
                 <w:tab w:val="left" w:pos="4680"/>
               </w:tabs>
+              <w:contextualSpacing/>
               <w:rPr>
                 <w:rFonts w:ascii="Palatino Linotype" w:hAnsi="Palatino Linotype"/>
                 <w:b/>
@@ -1273,6 +1291,7 @@
                 <w:tab w:val="left" w:pos="4320"/>
                 <w:tab w:val="left" w:pos="4680"/>
               </w:tabs>
+              <w:contextualSpacing/>
               <w:rPr>
                 <w:rFonts w:ascii="Palatino Linotype" w:hAnsi="Palatino Linotype"/>
                 <w:b/>
@@ -1345,6 +1364,7 @@
                 <w:tab w:val="left" w:pos="4320"/>
                 <w:tab w:val="left" w:pos="4680"/>
               </w:tabs>
+              <w:contextualSpacing/>
               <w:rPr>
                 <w:rFonts w:ascii="Palatino Linotype" w:hAnsi="Palatino Linotype"/>
                 <w:b/>
@@ -1432,6 +1452,7 @@
                 <w:tab w:val="left" w:pos="4320"/>
                 <w:tab w:val="left" w:pos="4680"/>
               </w:tabs>
+              <w:contextualSpacing/>
               <w:rPr>
                 <w:rFonts w:ascii="Palatino Linotype" w:hAnsi="Palatino Linotype"/>
                 <w:b/>
@@ -1470,6 +1491,7 @@
                 <w:tab w:val="left" w:pos="4320"/>
                 <w:tab w:val="left" w:pos="4680"/>
               </w:tabs>
+              <w:contextualSpacing/>
               <w:rPr>
                 <w:rFonts w:ascii="Palatino Linotype" w:hAnsi="Palatino Linotype"/>
                 <w:b/>
@@ -1552,6 +1574,7 @@
                 <w:tab w:val="left" w:pos="4320"/>
                 <w:tab w:val="left" w:pos="4680"/>
               </w:tabs>
+              <w:contextualSpacing/>
               <w:rPr>
                 <w:rFonts w:ascii="Palatino Linotype" w:hAnsi="Palatino Linotype"/>
                 <w:b/>
@@ -1624,6 +1647,7 @@
                 <w:tab w:val="left" w:pos="4320"/>
                 <w:tab w:val="left" w:pos="4680"/>
               </w:tabs>
+              <w:contextualSpacing/>
               <w:rPr>
                 <w:rFonts w:ascii="Palatino Linotype" w:hAnsi="Palatino Linotype"/>
                 <w:b/>
@@ -1711,6 +1735,7 @@
                 <w:tab w:val="left" w:pos="4320"/>
                 <w:tab w:val="left" w:pos="4680"/>
               </w:tabs>
+              <w:contextualSpacing/>
               <w:rPr>
                 <w:rFonts w:ascii="Palatino Linotype" w:hAnsi="Palatino Linotype"/>
                 <w:b/>
@@ -1759,6 +1784,7 @@
                 <w:tab w:val="left" w:pos="4320"/>
                 <w:tab w:val="left" w:pos="4680"/>
               </w:tabs>
+              <w:contextualSpacing/>
               <w:rPr>
                 <w:rFonts w:ascii="Palatino Linotype" w:hAnsi="Palatino Linotype"/>
                 <w:b/>
@@ -1841,6 +1867,7 @@
                 <w:tab w:val="left" w:pos="4320"/>
                 <w:tab w:val="left" w:pos="4680"/>
               </w:tabs>
+              <w:contextualSpacing/>
               <w:rPr>
                 <w:rFonts w:ascii="Palatino Linotype" w:hAnsi="Palatino Linotype"/>
                 <w:b/>
@@ -1913,6 +1940,7 @@
                 <w:tab w:val="left" w:pos="4320"/>
                 <w:tab w:val="left" w:pos="4680"/>
               </w:tabs>
+              <w:contextualSpacing/>
               <w:rPr>
                 <w:rFonts w:ascii="Palatino Linotype" w:hAnsi="Palatino Linotype"/>
                 <w:b/>
@@ -1979,7 +2007,11 @@
         </w:tc>
       </w:tr>
     </w:tbl>
-    <w:p/>
+    <w:p>
+      <w:pPr>
+        <w:contextualSpacing/>
+      </w:pPr>
+    </w:p>
     <w:sectPr>
       <w:pgSz w:w="12240" w:h="15840"/>
       <w:pgMar w:top="1440" w:right="1440" w:bottom="1440" w:left="1440" w:header="720" w:footer="720" w:gutter="0"/>

</xml_diff>